<commit_message>
changed author back to Emma
</commit_message>
<xml_diff>
--- a/docs/dielectric-IDEs_quick-start_guide.docx
+++ b/docs/dielectric-IDEs_quick-start_guide.docx
@@ -18,19 +18,19 @@
         <w:t xml:space="preserve">Python code accompanying </w:t>
       </w:r>
       <w:r>
-        <w:t>J</w:t>
+        <w:t>C</w:t>
       </w:r>
       <w:r>
         <w:t xml:space="preserve">. </w:t>
       </w:r>
       <w:r>
-        <w:t>S</w:t>
+        <w:t>E</w:t>
       </w:r>
       <w:r>
         <w:t xml:space="preserve">. </w:t>
       </w:r>
       <w:r>
-        <w:t xml:space="preserve">Colton </w:t>
+        <w:t xml:space="preserve">McClure </w:t>
       </w:r>
       <w:r>
         <w:t>et al., “Measuring Dielectric Functions of Thin Films Using Interdigitated Electrodes, with Application to Metal Halide Perovskites” (2026). Code and data: https://github.com/coltonlab/dielectric-IDEs. The examples below use the data files of the paper, which are in the data/ folder, so you can run them and compare your output with what is printed here. The code and data are released under the MIT License (see LICENSE).</w:t>

</xml_diff>

<commit_message>
small changes, e.g. 115 nm electrode height instead of 120 nm.
</commit_message>
<xml_diff>
--- a/docs/dielectric-IDEs_quick-start_guide.docx
+++ b/docs/dielectric-IDEs_quick-start_guide.docx
@@ -804,7 +804,7 @@
         <w:rPr>
           <w:rStyle w:val="VerbatimChar"/>
         </w:rPr>
-        <w:t xml:space="preserve">  f =    1019.4 Hz  eps_substrate = 4.5791  film eps_r = 95.3</w:t>
+        <w:t xml:space="preserve">  f =    1019.4 Hz  eps_substrate = 4.5797  film eps_r = 95.3</w:t>
       </w:r>
       <w:r>
         <w:br/>
@@ -822,7 +822,7 @@
         <w:rPr>
           <w:rStyle w:val="VerbatimChar"/>
         </w:rPr>
-        <w:t xml:space="preserve">  f =   99312.1 Hz  eps_substrate = 4.5346  film eps_r = 48.83</w:t>
+        <w:t xml:space="preserve">  f =   99312.1 Hz  eps_substrate = 4.5352  film eps_r = 48.84</w:t>
       </w:r>
       <w:r>
         <w:br/>
@@ -831,7 +831,7 @@
         <w:rPr>
           <w:rStyle w:val="VerbatimChar"/>
         </w:rPr>
-        <w:t xml:space="preserve">                    (Cp only 48.91; eps'' from G 8.58)</w:t>
+        <w:t xml:space="preserve">                    (Cp only 48.92; eps'' from G 8.58)</w:t>
       </w:r>
       <w:r>
         <w:br/>
@@ -840,7 +840,7 @@
         <w:rPr>
           <w:rStyle w:val="VerbatimChar"/>
         </w:rPr>
-        <w:t xml:space="preserve">  f = 1055353.3 Hz  eps_substrate = 4.5319  film eps_r = 46.93</w:t>
+        <w:t xml:space="preserve">  f = 1055353.3 Hz  eps_substrate = 4.5324  film eps_r = 46.94</w:t>
       </w:r>
       <w:r>
         <w:br/>
@@ -849,7 +849,7 @@
         <w:rPr>
           <w:rStyle w:val="VerbatimChar"/>
         </w:rPr>
-        <w:t xml:space="preserve">                    (Cp only 46.93; eps'' from G -0.171)</w:t>
+        <w:t xml:space="preserve">                    (Cp only 46.94; eps'' from G -0.171)</w:t>
       </w:r>
       <w:r>
         <w:br/>
@@ -858,7 +858,7 @@
         <w:rPr>
           <w:rStyle w:val="VerbatimChar"/>
         </w:rPr>
-        <w:t xml:space="preserve">  f = 9674842.1 Hz  eps_substrate = 4.5179  film eps_r = 46.25</w:t>
+        <w:t xml:space="preserve">  f = 9674842.1 Hz  eps_substrate = 4.5185  film eps_r = 46.25</w:t>
       </w:r>
     </w:p>
     <w:p>
@@ -866,7 +866,7 @@
         <w:pStyle w:val="FirstParagraph"/>
       </w:pPr>
       <w:r>
-        <w:t>The value at 9.67 MHz, 46.25, is the 46.2 of Fig. 7 of the paper. MAPI_s1.csv has one row per frequency (100 Hz–10 MHz by default) with these columns:</w:t>
+        <w:t>The value at 9.67 MHz, 46.25, is the 46.3 of Fig. 7 of the paper. MAPI_s1.csv has one row per frequency (100 Hz–10 MHz by default) with these columns:</w:t>
       </w:r>
     </w:p>
     <w:p>
@@ -1003,7 +1003,7 @@
         <w:pStyle w:val="FirstParagraph"/>
       </w:pPr>
       <w:r>
-        <w:t>This is the 46.2 ± 3.0 of the paper. The six items are those of Sec. IVB: absolute thickness (±20 nm), film-to-film thickness variation (4.4%), chip-to-chip variation of the blank (0.3%), the analyzer’s error at high frequency (0.27% at 9.67 MHz, ∝ f²), electrode geometry and model (0.5%), and capacitance resolution (0.0041 pF). These defaults describe our measurements; set your own, e.g. --dt-nm 10 if your thickness is known to ±10 nm. MAPI_s1_unc.csv gives every item at every frequency.</w:t>
+        <w:t>This is the 46.3 ± 3.0 of the paper. The six items are those of Sec. 4.2: absolute thickness (±20 nm), film-to-film thickness variation (4.4%), chip-to-chip variation of the blank (0.3%), the analyzer’s error at high frequency (0.27% at 9.67 MHz, ∝ f²), electrode geometry and model (0.5%), and capacitance resolution (0.0041 pF). These defaults describe our measurements; set your own, e.g. --dt-nm 10 if your thickness is known to ±10 nm. MAPI_s1_unc.csv gives every item at every frequency.</w:t>
       </w:r>
     </w:p>
     <w:p>
@@ -1042,7 +1042,7 @@
         <w:rPr>
           <w:rStyle w:val="VerbatimChar"/>
         </w:rPr>
-        <w:t>eps_i at 1.055e+06 Hz = 1.416 (NOT determined)</w:t>
+        <w:t>eps_i at 1.055e+06 Hz = 1.417 (NOT determined)</w:t>
       </w:r>
     </w:p>
     <w:p>
@@ -1089,7 +1089,7 @@
         <w:rPr>
           <w:rStyle w:val="VerbatimChar"/>
         </w:rPr>
-        <w:t>FEM (30240 nodes): S = 7.1796289   model: S = 7.1787841</w:t>
+        <w:t>FEM (30375 nodes): S = 7.1789243   model: S = 7.1780567</w:t>
       </w:r>
       <w:r>
         <w:br/>
@@ -1098,7 +1098,7 @@
         <w:rPr>
           <w:rStyle w:val="VerbatimChar"/>
         </w:rPr>
-        <w:t xml:space="preserve">    model/FEM - 1 = -0.0118%</w:t>
+        <w:t xml:space="preserve">    model/FEM - 1 = -0.0121%</w:t>
       </w:r>
     </w:p>
     <w:p>
@@ -1284,7 +1284,7 @@
               <w:pStyle w:val="Compact"/>
             </w:pPr>
             <w:r>
-              <w:t>the uncertainties of Sec. IVB</w:t>
+              <w:t>the uncertainties of Sec. 4.2</w:t>
             </w:r>
           </w:p>
         </w:tc>
@@ -1325,7 +1325,7 @@
               <w:pStyle w:val="Compact"/>
             </w:pPr>
             <w:r>
-              <w:t>εᵢ of all films (Fig. 5, Sec. IVB)</w:t>
+              <w:t>εᵢ of all films (Fig. 5, Sec. 4.2)</w:t>
             </w:r>
           </w:p>
         </w:tc>
@@ -1366,7 +1366,7 @@
               <w:pStyle w:val="Compact"/>
             </w:pPr>
             <w:r>
-              <w:t>Supplemental S4 and S9; recovery test of Sec. IIIB6</w:t>
+              <w:t>Supplemental S4 and S9; recovery test of Sec. 3.2.6</w:t>
             </w:r>
           </w:p>
         </w:tc>
@@ -1536,7 +1536,7 @@
         <w:rPr>
           <w:rStyle w:val="VerbatimChar"/>
         </w:rPr>
-        <w:t>geom = IDEGeometry(s_um=50.27, w_um=29.78, te_um=0.12, N=130, L_mm=7.475)</w:t>
+        <w:t>geom = IDEGeometry(s_um=50.27, w_um=29.78, te_um=0.115, N=130, L_mm=7.475)</w:t>
       </w:r>
       <w:r>
         <w:br/>

</xml_diff>